<commit_message>
Update resume professional summary
</commit_message>
<xml_diff>
--- a/public/Mohammad_Shafique_Khan_Resume.docx
+++ b/public/Mohammad_Shafique_Khan_Resume.docx
@@ -1,5 +1,51 @@
 
-<file path=word/document.xml><?xml version="1.0" encoding="utf-8"?>
+<file path=docProps\app.xml><?xml version="1.0" encoding="utf-8"?>
+<Properties xmlns="http://schemas.openxmlformats.org/officeDocument/2006/extended-properties" xmlns:vt="http://schemas.openxmlformats.org/officeDocument/2006/docPropsVTypes">
+  <Template>Normal</Template>
+  <TotalTime>21</TotalTime>
+  <Pages>1</Pages>
+  <Words>492</Words>
+  <Characters>2806</Characters>
+  <Application>Microsoft Office Word</Application>
+  <DocSecurity>0</DocSecurity>
+  <Lines>23</Lines>
+  <Paragraphs>6</Paragraphs>
+  <ScaleCrop>false</ScaleCrop>
+  <HeadingPairs>
+    <vt:vector size="2" baseType="variant">
+      <vt:variant>
+        <vt:lpstr>Title</vt:lpstr>
+      </vt:variant>
+      <vt:variant>
+        <vt:i4>1</vt:i4>
+      </vt:variant>
+    </vt:vector>
+  </HeadingPairs>
+  <TitlesOfParts>
+    <vt:vector size="1" baseType="lpstr">
+      <vt:lpstr/>
+    </vt:vector>
+  </TitlesOfParts>
+  <Company/>
+  <LinksUpToDate>false</LinksUpToDate>
+  <CharactersWithSpaces>3292</CharactersWithSpaces>
+  <SharedDoc>false</SharedDoc>
+  <HyperlinksChanged>false</HyperlinksChanged>
+  <AppVersion>16.0000</AppVersion>
+</Properties>
+</file>
+
+<file path=docProps\core.xml><?xml version="1.0" encoding="utf-8"?>
+<cp:coreProperties xmlns:cp="http://schemas.openxmlformats.org/package/2006/metadata/core-properties" xmlns:dc="http://purl.org/dc/elements/1.1/" xmlns:dcterms="http://purl.org/dc/terms/" xmlns:dcmitype="http://purl.org/dc/dcmitype/" xmlns:xsi="http://www.w3.org/2001/XMLSchema-instance">
+  <dc:creator>Un-named</dc:creator>
+  <cp:lastModifiedBy>Amir Khan</cp:lastModifiedBy>
+  <cp:revision>2</cp:revision>
+  <dcterms:created xsi:type="dcterms:W3CDTF">2026-09-03T15:19:00Z</dcterms:created>
+  <dcterms:modified xsi:type="dcterms:W3CDTF">2026-09-03T16:15:00Z</dcterms:modified>
+</cp:coreProperties>
+</file>
+
+<file path=word\document.xml><?xml version="1.0" encoding="utf-8"?>
 <w:document xmlns:wpc="http://schemas.microsoft.com/office/word/2010/wordprocessingCanvas" xmlns:cx="http://schemas.microsoft.com/office/drawing/2014/chartex" xmlns:cx1="http://schemas.microsoft.com/office/drawing/2015/9/8/chartex" xmlns:cx2="http://schemas.microsoft.com/office/drawing/2015/10/21/chartex" xmlns:cx3="http://schemas.microsoft.com/office/drawing/2016/5/9/chartex" xmlns:cx4="http://schemas.microsoft.com/office/drawing/2016/5/10/chartex" xmlns:cx5="http://schemas.microsoft.com/office/drawing/2016/5/11/chartex" xmlns:cx6="http://schemas.microsoft.com/office/drawing/2016/5/12/chartex" xmlns:cx7="http://schemas.microsoft.com/office/drawing/2016/5/13/chartex" xmlns:cx8="http://schemas.microsoft.com/office/drawing/2016/5/14/chartex" xmlns:mc="http://schemas.openxmlformats.org/markup-compatibility/2006" xmlns:aink="http://schemas.microsoft.com/office/drawing/2016/ink" xmlns:am3d="http://schemas.microsoft.com/office/drawing/2017/model3d" xmlns:o="urn:schemas-microsoft-com:office:office" xmlns:oel="http://schemas.microsoft.com/office/2019/extlst" xmlns:r="http://schemas.openxmlformats.org/officeDocument/2006/relationships" xmlns:m="http://schemas.openxmlformats.org/officeDocument/2006/math" xmlns:v="urn:schemas-microsoft-com:vml" xmlns:wp14="http://schemas.microsoft.com/office/word/2010/wordprocessingDrawing" xmlns:wp="http://schemas.openxmlformats.org/drawingml/2006/wordprocessingDrawing" xmlns:w10="urn:schemas-microsoft-com:office:word" xmlns:w="http://schemas.openxmlformats.org/wordprocessingml/2006/main" xmlns:w14="http://schemas.microsoft.com/office/word/2010/wordml" xmlns:w15="http://schemas.microsoft.com/office/word/2012/wordml" xmlns:w16cex="http://schemas.microsoft.com/office/word/2018/wordml/cex" xmlns:w16cid="http://schemas.microsoft.com/office/word/2016/wordml/cid" xmlns:w16="http://schemas.microsoft.com/office/word/2018/wordml" xmlns:w16du="http://schemas.microsoft.com/office/word/2023/wordml/word16du" xmlns:w16sdtdh="http://schemas.microsoft.com/office/word/2020/wordml/sdtdatahash" xmlns:w16sdtfl="http://schemas.microsoft.com/office/word/2024/wordml/sdtformatlock" xmlns:w16se="http://schemas.microsoft.com/office/word/2015/wordml/symex" xmlns:wpg="http://schemas.microsoft.com/office/word/2010/wordprocessingGroup" xmlns:wpi="http://schemas.microsoft.com/office/word/2010/wordprocessingInk" xmlns:wne="http://schemas.microsoft.com/office/word/2006/wordml" xmlns:wps="http://schemas.microsoft.com/office/word/2010/wordprocessingShape" mc:Ignorable="w14 w15 w16se w16cid w16 w16cex w16sdtdh w16sdtfl w16du wp14">
   <w:body>
     <w:p>
@@ -94,7 +140,7 @@
           <w:sz w:val="19"/>
           <w:szCs w:val="19"/>
         </w:rPr>
-        <w:t>Registered Pharmacist (Nepal Pharmacy Council, Reg. No. G7547) with 3.5+ years of experience across hospital pharmacy, pharmaceutical production, quality control, and retail/store operations. Skilled in medication dispensing, pharmacy inventory management, production and QC processes, and emergency preparedness. Seeking a pharmacist role in the Middle East to apply strong clinical, therapeutic, and operational expertise in a regulated healthcare or pharmaceutical manufacturing environment.</w:t>
+        <w:t>Registered Pharmacist (Nepal Pharmacy Council, Reg. No. G7547) with 3.5+ years of experience across hospital pharmacy, pharmaceutical production, quality control, and retail/store operations. Skilled in medication dispensing, pharmacy inventory management, production and QC processes, and emergency preparedness. Experienced in working within regulated healthcare and pharmaceutical manufacturing environments, with strong clinical, therapeutic, and operational expertise.</w:t>
       </w:r>
     </w:p>
     <w:p>
@@ -1158,7 +1204,38 @@
 </w:document>
 </file>
 
-<file path=word/numbering.xml><?xml version="1.0" encoding="utf-8"?>
+<file path=word\fontTable.xml><?xml version="1.0" encoding="utf-8"?>
+<w:fonts xmlns:mc="http://schemas.openxmlformats.org/markup-compatibility/2006" xmlns:r="http://schemas.openxmlformats.org/officeDocument/2006/relationships" xmlns:w="http://schemas.openxmlformats.org/wordprocessingml/2006/main" xmlns:w14="http://schemas.microsoft.com/office/word/2010/wordml" xmlns:w15="http://schemas.microsoft.com/office/word/2012/wordml" xmlns:w16cex="http://schemas.microsoft.com/office/word/2018/wordml/cex" xmlns:w16cid="http://schemas.microsoft.com/office/word/2016/wordml/cid" xmlns:w16="http://schemas.microsoft.com/office/word/2018/wordml" xmlns:w16du="http://schemas.microsoft.com/office/word/2023/wordml/word16du" xmlns:w16sdtdh="http://schemas.microsoft.com/office/word/2020/wordml/sdtdatahash" xmlns:w16sdtfl="http://schemas.microsoft.com/office/word/2024/wordml/sdtformatlock" xmlns:w16se="http://schemas.microsoft.com/office/word/2015/wordml/symex" mc:Ignorable="w14 w15 w16se w16cid w16 w16cex w16sdtdh w16sdtfl w16du">
+  <w:font w:name="Times New Roman">
+    <w:panose1 w:val="02020603050405020304"/>
+    <w:charset w:val="00"/>
+    <w:family w:val="roman"/>
+    <w:pitch w:val="variable"/>
+    <w:sig w:usb0="E0002EFF" w:usb1="C000785B" w:usb2="00000009" w:usb3="00000000" w:csb0="000001FF" w:csb1="00000000"/>
+  </w:font>
+  <w:font w:name="Calibri">
+    <w:panose1 w:val="020F0502020204030204"/>
+    <w:charset w:val="00"/>
+    <w:family w:val="swiss"/>
+    <w:pitch w:val="variable"/>
+    <w:sig w:usb0="E4002EFF" w:usb1="C200ACFF" w:usb2="00000009" w:usb3="00000000" w:csb0="000001FF" w:csb1="00000000"/>
+  </w:font>
+  <w:font w:name="Aptos Display">
+    <w:charset w:val="00"/>
+    <w:family w:val="swiss"/>
+    <w:pitch w:val="variable"/>
+    <w:sig w:usb0="20000287" w:usb1="00000003" w:usb2="00000000" w:usb3="00000000" w:csb0="0000019F" w:csb1="00000000"/>
+  </w:font>
+  <w:font w:name="Aptos">
+    <w:charset w:val="00"/>
+    <w:family w:val="swiss"/>
+    <w:pitch w:val="variable"/>
+    <w:sig w:usb0="20000287" w:usb1="00000003" w:usb2="00000000" w:usb3="00000000" w:csb0="0000019F" w:csb1="00000000"/>
+  </w:font>
+</w:fonts>
+</file>
+
+<file path=word\numbering.xml><?xml version="1.0" encoding="utf-8"?>
 <w:numbering xmlns:wpc="http://schemas.microsoft.com/office/word/2010/wordprocessingCanvas" xmlns:cx="http://schemas.microsoft.com/office/drawing/2014/chartex" xmlns:cx1="http://schemas.microsoft.com/office/drawing/2015/9/8/chartex" xmlns:cx2="http://schemas.microsoft.com/office/drawing/2015/10/21/chartex" xmlns:cx3="http://schemas.microsoft.com/office/drawing/2016/5/9/chartex" xmlns:cx4="http://schemas.microsoft.com/office/drawing/2016/5/10/chartex" xmlns:cx5="http://schemas.microsoft.com/office/drawing/2016/5/11/chartex" xmlns:cx6="http://schemas.microsoft.com/office/drawing/2016/5/12/chartex" xmlns:cx7="http://schemas.microsoft.com/office/drawing/2016/5/13/chartex" xmlns:cx8="http://schemas.microsoft.com/office/drawing/2016/5/14/chartex" xmlns:mc="http://schemas.openxmlformats.org/markup-compatibility/2006" xmlns:aink="http://schemas.microsoft.com/office/drawing/2016/ink" xmlns:am3d="http://schemas.microsoft.com/office/drawing/2017/model3d" xmlns:o="urn:schemas-microsoft-com:office:office" xmlns:oel="http://schemas.microsoft.com/office/2019/extlst" xmlns:r="http://schemas.openxmlformats.org/officeDocument/2006/relationships" xmlns:m="http://schemas.openxmlformats.org/officeDocument/2006/math" xmlns:v="urn:schemas-microsoft-com:vml" xmlns:wp14="http://schemas.microsoft.com/office/word/2010/wordprocessingDrawing" xmlns:wp="http://schemas.openxmlformats.org/drawingml/2006/wordprocessingDrawing" xmlns:w10="urn:schemas-microsoft-com:office:word" xmlns:w="http://schemas.openxmlformats.org/wordprocessingml/2006/main" xmlns:w14="http://schemas.microsoft.com/office/word/2010/wordml" xmlns:w15="http://schemas.microsoft.com/office/word/2012/wordml" xmlns:w16cex="http://schemas.microsoft.com/office/word/2018/wordml/cex" xmlns:w16cid="http://schemas.microsoft.com/office/word/2016/wordml/cid" xmlns:w16="http://schemas.microsoft.com/office/word/2018/wordml" xmlns:w16du="http://schemas.microsoft.com/office/word/2023/wordml/word16du" xmlns:w16sdtdh="http://schemas.microsoft.com/office/word/2020/wordml/sdtdatahash" xmlns:w16sdtfl="http://schemas.microsoft.com/office/word/2024/wordml/sdtformatlock" xmlns:w16se="http://schemas.microsoft.com/office/word/2015/wordml/symex" xmlns:wpg="http://schemas.microsoft.com/office/word/2010/wordprocessingGroup" xmlns:wpi="http://schemas.microsoft.com/office/word/2010/wordprocessingInk" xmlns:wne="http://schemas.microsoft.com/office/word/2006/wordml" xmlns:wps="http://schemas.microsoft.com/office/word/2010/wordprocessingShape" mc:Ignorable="w14 w15 w16se w16cid w16 w16cex w16sdtdh w16sdtfl w16du wp14">
   <w:abstractNum w:abstractNumId="0" w15:restartNumberingAfterBreak="0">
     <w:nsid w:val="15E10068"/>
@@ -1315,7 +1392,57 @@
 </w:numbering>
 </file>
 
-<file path=word/styles.xml><?xml version="1.0" encoding="utf-8"?>
+<file path=word\settings.xml><?xml version="1.0" encoding="utf-8"?>
+<w:settings xmlns:mc="http://schemas.openxmlformats.org/markup-compatibility/2006" xmlns:o="urn:schemas-microsoft-com:office:office" xmlns:r="http://schemas.openxmlformats.org/officeDocument/2006/relationships" xmlns:m="http://schemas.openxmlformats.org/officeDocument/2006/math" xmlns:v="urn:schemas-microsoft-com:vml" xmlns:w10="urn:schemas-microsoft-com:office:word" xmlns:w="http://schemas.openxmlformats.org/wordprocessingml/2006/main" xmlns:w14="http://schemas.microsoft.com/office/word/2010/wordml" xmlns:w15="http://schemas.microsoft.com/office/word/2012/wordml" xmlns:w16cex="http://schemas.microsoft.com/office/word/2018/wordml/cex" xmlns:w16cid="http://schemas.microsoft.com/office/word/2016/wordml/cid" xmlns:w16="http://schemas.microsoft.com/office/word/2018/wordml" xmlns:w16du="http://schemas.microsoft.com/office/word/2023/wordml/word16du" xmlns:w16sdtdh="http://schemas.microsoft.com/office/word/2020/wordml/sdtdatahash" xmlns:w16sdtfl="http://schemas.microsoft.com/office/word/2024/wordml/sdtformatlock" xmlns:w16se="http://schemas.microsoft.com/office/word/2015/wordml/symex" xmlns:sl="http://schemas.openxmlformats.org/schemaLibrary/2006/main" mc:Ignorable="w14 w15 w16se w16cid w16 w16cex w16sdtdh w16sdtfl w16du">
+  <w:zoom w:percent="100"/>
+  <w:displayBackgroundShape/>
+  <w:proofState w:spelling="clean" w:grammar="clean"/>
+  <w:defaultTabStop w:val="720"/>
+  <w:characterSpacingControl w:val="doNotCompress"/>
+  <w:compat>
+    <w:compatSetting w:name="compatibilityMode" w:uri="http://schemas.microsoft.com/office/word" w:val="15"/>
+    <w:compatSetting w:name="overrideTableStyleFontSizeAndJustification" w:uri="http://schemas.microsoft.com/office/word" w:val="1"/>
+    <w:compatSetting w:name="enableOpenTypeFeatures" w:uri="http://schemas.microsoft.com/office/word" w:val="1"/>
+    <w:compatSetting w:name="doNotFlipMirrorIndents" w:uri="http://schemas.microsoft.com/office/word" w:val="1"/>
+    <w:compatSetting w:name="differentiateMultirowTableHeaders" w:uri="http://schemas.microsoft.com/office/word" w:val="1"/>
+    <w:compatSetting w:name="useWord2013TrackBottomHyphenation" w:uri="http://schemas.microsoft.com/office/word" w:val="1"/>
+  </w:compat>
+  <w:rsids>
+    <w:rsidRoot w:val="00E308F4"/>
+    <w:rsid w:val="00142C74"/>
+    <w:rsid w:val="001954D2"/>
+    <w:rsid w:val="00E308F4"/>
+    <w:rsid w:val="00F7271E"/>
+  </w:rsids>
+  <m:mathPr>
+    <m:mathFont m:val="Cambria Math"/>
+    <m:brkBin m:val="before"/>
+    <m:brkBinSub m:val="--"/>
+    <m:smallFrac m:val="0"/>
+    <m:dispDef/>
+    <m:lMargin m:val="0"/>
+    <m:rMargin m:val="0"/>
+    <m:defJc m:val="centerGroup"/>
+    <m:wrapIndent m:val="1440"/>
+    <m:intLim m:val="subSup"/>
+    <m:naryLim m:val="undOvr"/>
+  </m:mathPr>
+  <w:themeFontLang w:val="en-IN"/>
+  <w:clrSchemeMapping w:bg1="light1" w:t1="dark1" w:bg2="light2" w:t2="dark2" w:accent1="accent1" w:accent2="accent2" w:accent3="accent3" w:accent4="accent4" w:accent5="accent5" w:accent6="accent6" w:hyperlink="hyperlink" w:followedHyperlink="followedHyperlink"/>
+  <w:shapeDefaults>
+    <o:shapedefaults v:ext="edit" spidmax="1026"/>
+    <o:shapelayout v:ext="edit">
+      <o:idmap v:ext="edit" data="1"/>
+    </o:shapelayout>
+  </w:shapeDefaults>
+  <w:decimalSymbol w:val="."/>
+  <w:listSeparator w:val=","/>
+  <w14:docId w14:val="53DCAC09"/>
+  <w15:docId w15:val="{B9D368D5-B36F-4C20-B131-F11B5523B371}"/>
+</w:settings>
+</file>
+
+<file path=word\styles.xml><?xml version="1.0" encoding="utf-8"?>
 <w:styles xmlns:mc="http://schemas.openxmlformats.org/markup-compatibility/2006" xmlns:r="http://schemas.openxmlformats.org/officeDocument/2006/relationships" xmlns:w="http://schemas.openxmlformats.org/wordprocessingml/2006/main" xmlns:w14="http://schemas.microsoft.com/office/word/2010/wordml" xmlns:w15="http://schemas.microsoft.com/office/word/2012/wordml" xmlns:w16cex="http://schemas.microsoft.com/office/word/2018/wordml/cex" xmlns:w16cid="http://schemas.microsoft.com/office/word/2016/wordml/cid" xmlns:w16="http://schemas.microsoft.com/office/word/2018/wordml" xmlns:w16du="http://schemas.microsoft.com/office/word/2023/wordml/word16du" xmlns:w16sdtdh="http://schemas.microsoft.com/office/word/2020/wordml/sdtdatahash" xmlns:w16sdtfl="http://schemas.microsoft.com/office/word/2024/wordml/sdtformatlock" xmlns:w16se="http://schemas.microsoft.com/office/word/2015/wordml/symex" mc:Ignorable="w14 w15 w16se w16cid w16 w16cex w16sdtdh w16sdtfl w16du">
   <w:docDefaults>
     <w:rPrDefault>
@@ -1906,7 +2033,7 @@
 </w:styles>
 </file>
 
-<file path=word/theme/theme1.xml><?xml version="1.0" encoding="utf-8"?>
+<file path=word\theme\theme1.xml><?xml version="1.0" encoding="utf-8"?>
 <a:theme xmlns:a="http://schemas.openxmlformats.org/drawingml/2006/main" name="Office Theme">
   <a:themeElements>
     <a:clrScheme name="Office">
@@ -2219,4 +2346,8 @@
     </a:ext>
   </a:extLst>
 </a:theme>
+</file>
+
+<file path=word\webSettings.xml><?xml version="1.0" encoding="utf-8"?>
+<w:webSettings xmlns:mc="http://schemas.openxmlformats.org/markup-compatibility/2006" xmlns:r="http://schemas.openxmlformats.org/officeDocument/2006/relationships" xmlns:w="http://schemas.openxmlformats.org/wordprocessingml/2006/main" xmlns:w14="http://schemas.microsoft.com/office/word/2010/wordml" xmlns:w15="http://schemas.microsoft.com/office/word/2012/wordml" xmlns:w16cex="http://schemas.microsoft.com/office/word/2018/wordml/cex" xmlns:w16cid="http://schemas.microsoft.com/office/word/2016/wordml/cid" xmlns:w16="http://schemas.microsoft.com/office/word/2018/wordml" xmlns:w16du="http://schemas.microsoft.com/office/word/2023/wordml/word16du" xmlns:w16sdtdh="http://schemas.microsoft.com/office/word/2020/wordml/sdtdatahash" xmlns:w16sdtfl="http://schemas.microsoft.com/office/word/2024/wordml/sdtformatlock" xmlns:w16se="http://schemas.microsoft.com/office/word/2015/wordml/symex" mc:Ignorable="w14 w15 w16se w16cid w16 w16cex w16sdtdh w16sdtfl w16du"/>
 </file>
</xml_diff>